<commit_message>
Bug fix: login/home page
Risolti i bug che bloccano l'accesso al sito
</commit_message>
<xml_diff>
--- a/3_Documentazione/documentazione progetto.docx
+++ b/3_Documentazione/documentazione progetto.docx
@@ -7352,6 +7352,117 @@
       <w:r>
         <w:t xml:space="preserve"> Idea 21</w:t>
       </w:r>
+      <w:r>
+        <w:t xml:space="preserve">, librerie di Java Spring: Spring boot </w:t>
+      </w:r>
+      <w:proofErr w:type="spellStart"/>
+      <w:r>
+        <w:t>DevTools</w:t>
+      </w:r>
+      <w:proofErr w:type="spellEnd"/>
+      <w:r>
+        <w:t xml:space="preserve"> (</w:t>
+      </w:r>
+      <w:proofErr w:type="spellStart"/>
+      <w:proofErr w:type="gramStart"/>
+      <w:r>
+        <w:t>org.springframework</w:t>
+      </w:r>
+      <w:proofErr w:type="gramEnd"/>
+      <w:r>
+        <w:t>.boot</w:t>
+      </w:r>
+      <w:proofErr w:type="spellEnd"/>
+      <w:r>
+        <w:t xml:space="preserve">), </w:t>
+      </w:r>
+      <w:proofErr w:type="spellStart"/>
+      <w:r>
+        <w:t>Thymelife</w:t>
+      </w:r>
+      <w:proofErr w:type="spellEnd"/>
+      <w:r>
+        <w:t xml:space="preserve"> (</w:t>
+      </w:r>
+      <w:proofErr w:type="spellStart"/>
+      <w:r>
+        <w:t>org.thymelife</w:t>
+      </w:r>
+      <w:proofErr w:type="spellEnd"/>
+      <w:r>
+        <w:t>), Lombok</w:t>
+      </w:r>
+      <w:r>
+        <w:t xml:space="preserve"> (</w:t>
+      </w:r>
+      <w:proofErr w:type="spellStart"/>
+      <w:r>
+        <w:t>org.projectlombok</w:t>
+      </w:r>
+      <w:proofErr w:type="spellEnd"/>
+      <w:r>
+        <w:t>)</w:t>
+      </w:r>
+      <w:r>
+        <w:t>, Spring Web</w:t>
+      </w:r>
+      <w:r>
+        <w:t xml:space="preserve"> ()</w:t>
+      </w:r>
+      <w:r>
+        <w:t xml:space="preserve">, JDBC API, </w:t>
+      </w:r>
+      <w:proofErr w:type="spellStart"/>
+      <w:r>
+        <w:t>Sping</w:t>
+      </w:r>
+      <w:proofErr w:type="spellEnd"/>
+      <w:r>
+        <w:t xml:space="preserve"> Data JPA, MySQL Driver, </w:t>
+      </w:r>
+      <w:proofErr w:type="spellStart"/>
+      <w:r>
+        <w:t>Validation</w:t>
+      </w:r>
+      <w:proofErr w:type="spellEnd"/>
+      <w:r>
+        <w:t xml:space="preserve"> (</w:t>
+      </w:r>
+      <w:proofErr w:type="spellStart"/>
+      <w:r>
+        <w:t>org.springframework.boot</w:t>
+      </w:r>
+      <w:proofErr w:type="spellEnd"/>
+      <w:r>
+        <w:t>)</w:t>
+      </w:r>
+      <w:r>
+        <w:t xml:space="preserve">, </w:t>
+      </w:r>
+      <w:proofErr w:type="spellStart"/>
+      <w:r>
+        <w:t>CycloneDX</w:t>
+      </w:r>
+      <w:proofErr w:type="spellEnd"/>
+      <w:r>
+        <w:t xml:space="preserve"> SBOM support, </w:t>
+      </w:r>
+      <w:proofErr w:type="spellStart"/>
+      <w:r>
+        <w:t>TCGdex</w:t>
+      </w:r>
+      <w:proofErr w:type="spellEnd"/>
+      <w:r>
+        <w:t xml:space="preserve"> SDK (</w:t>
+      </w:r>
+      <w:proofErr w:type="spellStart"/>
+      <w:r>
+        <w:t>net.tcgdex</w:t>
+      </w:r>
+      <w:proofErr w:type="spellEnd"/>
+      <w:r>
+        <w:t xml:space="preserve">); </w:t>
+      </w:r>
     </w:p>
     <w:p>
       <w:pPr>
@@ -7375,13 +7486,40 @@
     </w:p>
     <w:p>
       <w:r>
-        <w:t xml:space="preserve">Su quale piattaforma dovrà essere eseguito il prodotto? Che hardware particolare è coinvolto nel progetto? Che particolarità e limitazioni presenta? Che </w:t>
-      </w:r>
-      <w:r>
-        <w:t>HW</w:t>
-      </w:r>
-      <w:r>
-        <w:t xml:space="preserve"> sarà disponibile durante lo sviluppo?</w:t>
+        <w:t>Il prodotto verrà eseguito sul browser in quanto è un app Web</w:t>
+      </w:r>
+      <w:r>
+        <w:t xml:space="preserve">, durante lo sviluppo verrà testato su Google Chrome sul computer fornito dalla scuola, un Windows 11 </w:t>
+      </w:r>
+      <w:proofErr w:type="spellStart"/>
+      <w:r>
+        <w:t>Education</w:t>
+      </w:r>
+      <w:proofErr w:type="spellEnd"/>
+      <w:r>
+        <w:t xml:space="preserve">, versione 23H2, con processore </w:t>
+      </w:r>
+      <w:r>
+        <w:t xml:space="preserve">13th </w:t>
+      </w:r>
+      <w:proofErr w:type="spellStart"/>
+      <w:r>
+        <w:t>Gen</w:t>
+      </w:r>
+      <w:proofErr w:type="spellEnd"/>
+      <w:r>
+        <w:t xml:space="preserve"> Intel(R) </w:t>
+      </w:r>
+      <w:proofErr w:type="gramStart"/>
+      <w:r>
+        <w:t>Core(</w:t>
+      </w:r>
+      <w:proofErr w:type="gramEnd"/>
+      <w:r>
+        <w:t>TM) i7-13700   2.10 GHz</w:t>
+      </w:r>
+      <w:r>
+        <w:t xml:space="preserve"> e una RAM di 32 GB con 31.7 GB già usati. Durante lo sviluppo il lavoro potrà essere portato avanti da un Windows 11 personale.</w:t>
       </w:r>
     </w:p>
     <w:p>
@@ -7528,7 +7666,6 @@
         <w:keepNext/>
       </w:pPr>
       <w:r>
-        <w:lastRenderedPageBreak/>
         <w:t>Diagramma Chen</w:t>
       </w:r>
       <w:r>
@@ -7892,58 +8029,18 @@
     </w:p>
     <w:p>
       <w:r>
-        <w:t>In questo capitolo dovrà essere mostrato come è stato realizzato il lavoro. Questa parte può differenziarsi dalla progettazione in quanto il risultato ottenuto non per forza può essere come era stato progettato.</w:t>
+        <w:t xml:space="preserve">Per prima cosa bisogna creare un progetto di Java </w:t>
+      </w:r>
+      <w:proofErr w:type="spellStart"/>
+      <w:r>
+        <w:t>Sping</w:t>
+      </w:r>
+      <w:proofErr w:type="spellEnd"/>
+      <w:r>
+        <w:t>.</w:t>
       </w:r>
     </w:p>
-    <w:p>
-      <w:r>
-        <w:t xml:space="preserve">Sulla base di queste informazioni il lavoro svolto dovrà essere riproducibile. </w:t>
-      </w:r>
-    </w:p>
-    <w:p>
-      <w:r>
-        <w:t>In questa parte è richiesto l’inserimento di codice sorgente</w:t>
-      </w:r>
-      <w:r>
-        <w:t xml:space="preserve"> - </w:t>
-      </w:r>
-      <w:r>
-        <w:t>P</w:t>
-      </w:r>
-      <w:r>
-        <w:t xml:space="preserve">rint </w:t>
-      </w:r>
-      <w:r>
-        <w:t>S</w:t>
-      </w:r>
-      <w:r>
-        <w:t xml:space="preserve">creen </w:t>
-      </w:r>
-      <w:r>
-        <w:t xml:space="preserve">- </w:t>
-      </w:r>
-      <w:r>
-        <w:t>di maschere solamente per quei passaggi particolarmente significativi e/o critici.</w:t>
-      </w:r>
-    </w:p>
-    <w:p>
-      <w:r>
-        <w:t>Inoltre,</w:t>
-      </w:r>
-      <w:r>
-        <w:t xml:space="preserve"> dovranno essere descritte eventuali varianti di soluzione o scelte di prodotti con motivazione delle scelte.</w:t>
-      </w:r>
-    </w:p>
-    <w:p>
-      <w:r>
-        <w:t>Non deve apparire nessuna forma di guida d’uso di librerie o di componenti utilizzati. Eventualmente questa va allegata.</w:t>
-      </w:r>
-    </w:p>
-    <w:p>
-      <w:r>
-        <w:t>Per eventuali dettagli si possono inserire riferimenti ai diari.</w:t>
-      </w:r>
-    </w:p>
+    <w:p/>
     <w:p>
       <w:pPr>
         <w:pStyle w:val="Titolo1"/>
@@ -8475,7 +8572,6 @@
                 <w:szCs w:val="24"/>
                 <w:lang w:val="en-US"/>
               </w:rPr>
-              <w:lastRenderedPageBreak/>
               <w:t>Research the “</w:t>
             </w:r>
             <w:r>
@@ -11156,7 +11252,7 @@
         <w:noProof/>
         <w:sz w:val="20"/>
       </w:rPr>
-      <w:t>03.10.2026</w:t>
+      <w:t>16.10.2026</w:t>
     </w:r>
     <w:r>
       <w:rPr>
@@ -11384,7 +11480,7 @@
         <w:noProof/>
         <w:sz w:val="20"/>
       </w:rPr>
-      <w:t>03.10.2026</w:t>
+      <w:t>16.10.2026</w:t>
     </w:r>
     <w:r>
       <w:rPr>
@@ -16867,7 +16963,6 @@
   <w:style w:type="character" w:default="1" w:styleId="Carpredefinitoparagrafo">
     <w:name w:val="Default Paragraph Font"/>
     <w:uiPriority w:val="1"/>
-    <w:semiHidden/>
     <w:unhideWhenUsed/>
   </w:style>
   <w:style w:type="table" w:default="1" w:styleId="Tabellanormale">
@@ -17276,6 +17371,31 @@
       <w:shd w:val="clear" w:color="auto" w:fill="E1DFDD"/>
     </w:rPr>
   </w:style>
+  <w:style w:type="paragraph" w:styleId="PreformattatoHTML">
+    <w:name w:val="HTML Preformatted"/>
+    <w:basedOn w:val="Normale"/>
+    <w:link w:val="PreformattatoHTMLCarattere"/>
+    <w:uiPriority w:val="99"/>
+    <w:semiHidden/>
+    <w:unhideWhenUsed/>
+    <w:rsid w:val="00877546"/>
+    <w:rPr>
+      <w:rFonts w:ascii="Consolas" w:hAnsi="Consolas"/>
+      <w:sz w:val="20"/>
+    </w:rPr>
+  </w:style>
+  <w:style w:type="character" w:customStyle="1" w:styleId="PreformattatoHTMLCarattere">
+    <w:name w:val="Preformattato HTML Carattere"/>
+    <w:basedOn w:val="Carpredefinitoparagrafo"/>
+    <w:link w:val="PreformattatoHTML"/>
+    <w:uiPriority w:val="99"/>
+    <w:semiHidden/>
+    <w:rsid w:val="00877546"/>
+    <w:rPr>
+      <w:rFonts w:ascii="Consolas" w:hAnsi="Consolas"/>
+      <w:lang w:eastAsia="it-IT"/>
+    </w:rPr>
+  </w:style>
 </w:styles>
 </file>
 

</xml_diff>